<commit_message>
TAD v1.5: describe the LangChain usage accurately (no .batch; batching is in the prompt)
Co-Authored-By: Claude Opus 5.5 <noreply@anthropic.com>
</commit_message>
<xml_diff>
--- a/docs/Technical-Architecture-Document.docx
+++ b/docs/Technical-Architecture-Document.docx
@@ -172,7 +172,7 @@
                 <w:i w:val="0"/>
                 <w:sz w:val="20"/>
               </w:rPr>
-              <w:t>4 October 2026 · v1.4, reviewed against the deployed demo app</w:t>
+              <w:t>4 October 2026 · v1.5, reviewed against the deployed demo app</w:t>
             </w:r>
           </w:p>
         </w:tc>
@@ -3364,7 +3364,7 @@
                 <w:i w:val="0"/>
                 <w:sz w:val="19"/>
               </w:rPr>
-              <w:t>LangChain (LCEL chains, with_structured_output, .batch); no LangGraph</w:t>
+              <w:t>LangChain: ChatGroq / ChatOpenAI, ChatPromptTemplate, with_structured_output (strict JSON schema), LCEL chains (prompt | model) called with .invoke(); no LangGraph, agents or memory. Batching is done in the prompt (15 messages per call), not with .batch()</w:t>
             </w:r>
           </w:p>
         </w:tc>
@@ -3397,7 +3397,7 @@
                 <w:i w:val="0"/>
                 <w:sz w:val="19"/>
               </w:rPr>
-              <w:t>Team standard; readable step-by-step chains; provider can be swapped</w:t>
+              <w:t>Team standard; one small wrapper (core/llm.py) for every model call; provider can be swapped by a setting</w:t>
             </w:r>
           </w:p>
         </w:tc>

</xml_diff>

<commit_message>
Docs for demo mode: README, env template, TAD v1.6
Co-Authored-By: Claude Opus 5.5 <noreply@anthropic.com>
</commit_message>
<xml_diff>
--- a/docs/Technical-Architecture-Document.docx
+++ b/docs/Technical-Architecture-Document.docx
@@ -172,7 +172,7 @@
                 <w:i w:val="0"/>
                 <w:sz w:val="20"/>
               </w:rPr>
-              <w:t>4 October 2026 · v1.5, reviewed against the deployed demo app</w:t>
+              <w:t>4 October 2026 · v1.6, reviewed against the deployed demo app</w:t>
             </w:r>
           </w:p>
         </w:tc>
@@ -733,7 +733,7 @@
                 <w:i w:val="0"/>
                 <w:sz w:val="19"/>
               </w:rPr>
-              <w:t>Sign-in, then only the screens for that role: Priority queue and Delay scorecard (Neha), Guidance review (Ms Chhaya Gupta). Hosted on Streamlit Community Cloud; redeploys on every push to GitHub.</w:t>
+              <w:t>Sign-in (or, in demo mode, straight in as Neha with a switch to Ms Chhaya Gupta), then only the screens for that role: Priority queue and Delay scorecard (Neha), Guidance review (Ms Chhaya Gupta). Hosted on Streamlit Community Cloud; redeploys on every push to GitHub.</w:t>
             </w:r>
           </w:p>
         </w:tc>
@@ -8972,7 +8972,25 @@
           <w:i w:val="0"/>
           <w:sz w:val="20"/>
         </w:rPr>
-        <w:t>The demo app holds only sample data. The Supabase admin (secret) key and the demo passwords are not stored in the hosted app.</w:t>
+        <w:t>The demo app holds only sample data. The Supabase admin (secret) key is not stored in the hosted app.</w:t>
+      </w:r>
+    </w:p>
+    <w:p>
+      <w:pPr>
+        <w:numPr>
+          <w:ilvl w:val="0"/>
+          <w:numId w:val="9002"/>
+        </w:numPr>
+        <w:spacing w:before="0" w:after="60" w:line="276" w:lineRule="auto"/>
+      </w:pPr>
+      <w:r>
+        <w:rPr>
+          <w:rFonts w:ascii="Times New Roman" w:hAnsi="Times New Roman" w:eastAsia="Times New Roman"/>
+          <w:b w:val="0"/>
+          <w:i w:val="0"/>
+          <w:sz w:val="20"/>
+        </w:rPr>
+        <w:t>Demo mode (on for the evaluation link): the link opens without a sign-in page. The app signs in server-side as Neha, or as Ms Chhaya Gupta via the switch button or ?as=chhaya, using the two demo passwords held in its secrets; they never reach the browser, and the database still applies that person's access rules. Trade-off: anyone with the link can click actions and try messages. For a pilot on real data, DEMO_MODE=false brings back the sign-in page.</w:t>
       </w:r>
     </w:p>
     <w:p>

</xml_diff>